<commit_message>
Added Updated Skill Experiments 11 to 13
</commit_message>
<xml_diff>
--- a/2400031810 FSAD Skill - 12.docx
+++ b/2400031810 FSAD Skill - 12.docx
@@ -64,19 +64,11 @@
                 <w:sz w:val="24"/>
               </w:rPr>
             </w:pPr>
-            <w:proofErr w:type="spellStart"/>
             <w:r>
               <w:rPr>
                 <w:sz w:val="24"/>
               </w:rPr>
-              <w:t>Aravala</w:t>
-            </w:r>
-            <w:proofErr w:type="spellEnd"/>
-            <w:r>
-              <w:rPr>
-                <w:sz w:val="24"/>
-              </w:rPr>
-              <w:t xml:space="preserve"> Tirupathi Venkata Jathin Kumar</w:t>
+              <w:t>S. LALITH ADITYA</w:t>
             </w:r>
           </w:p>
         </w:tc>
@@ -125,14 +117,14 @@
                 <w:spacing w:val="-2"/>
                 <w:sz w:val="24"/>
               </w:rPr>
-              <w:t>2400031</w:t>
+              <w:t>240003</w:t>
             </w:r>
             <w:r>
               <w:rPr>
                 <w:spacing w:val="-2"/>
                 <w:sz w:val="24"/>
               </w:rPr>
-              <w:t>734</w:t>
+              <w:t>1810</w:t>
             </w:r>
           </w:p>
         </w:tc>
@@ -471,7 +463,6 @@
           <w:sz w:val="20"/>
         </w:rPr>
         <w:sectPr>
-          <w:headerReference w:type="default" r:id="rId8"/>
           <w:type w:val="continuous"/>
           <w:pgSz w:w="11920" w:h="16850"/>
           <w:pgMar w:top="1380" w:right="1275" w:bottom="280" w:left="1275" w:header="720" w:footer="720" w:gutter="0"/>
@@ -510,7 +501,7 @@
                     <pic:cNvPicPr/>
                   </pic:nvPicPr>
                   <pic:blipFill>
-                    <a:blip r:embed="rId9" cstate="print"/>
+                    <a:blip r:embed="rId8" cstate="print"/>
                     <a:stretch>
                       <a:fillRect/>
                     </a:stretch>
@@ -641,7 +632,7 @@
                     <pic:cNvPicPr/>
                   </pic:nvPicPr>
                   <pic:blipFill>
-                    <a:blip r:embed="rId10" cstate="print"/>
+                    <a:blip r:embed="rId9" cstate="print"/>
                     <a:stretch>
                       <a:fillRect/>
                     </a:stretch>
@@ -706,7 +697,7 @@
                     <pic:cNvPicPr/>
                   </pic:nvPicPr>
                   <pic:blipFill>
-                    <a:blip r:embed="rId11" cstate="print"/>
+                    <a:blip r:embed="rId10" cstate="print"/>
                     <a:stretch>
                       <a:fillRect/>
                     </a:stretch>
@@ -759,9 +750,88 @@
         <w:ind w:left="142"/>
         <w:rPr>
           <w:rFonts w:ascii="Times New Roman"/>
-          <w:sz w:val="20"/>
-        </w:rPr>
-      </w:pPr>
+          <w:b/>
+          <w:bCs/>
+          <w:sz w:val="20"/>
+          <w:u w:val="single"/>
+        </w:rPr>
+      </w:pPr>
+      <w:r>
+        <w:rPr>
+          <w:rFonts w:ascii="Times New Roman"/>
+          <w:b/>
+          <w:bCs/>
+          <w:sz w:val="20"/>
+          <w:u w:val="single"/>
+        </w:rPr>
+        <w:t>GITHUB REPO OUTPUT</w:t>
+      </w:r>
+      <w:r>
+        <w:rPr>
+          <w:rFonts w:ascii="Times New Roman"/>
+          <w:b/>
+          <w:bCs/>
+          <w:sz w:val="20"/>
+          <w:u w:val="single"/>
+        </w:rPr>
+        <w:t>:</w:t>
+      </w:r>
+    </w:p>
+    <w:p>
+      <w:pPr>
+        <w:ind w:left="142"/>
+        <w:rPr>
+          <w:rFonts w:ascii="Times New Roman"/>
+          <w:b/>
+          <w:bCs/>
+          <w:sz w:val="20"/>
+          <w:u w:val="single"/>
+        </w:rPr>
+      </w:pPr>
+      <w:r>
+        <w:rPr>
+          <w:rFonts w:ascii="Times New Roman"/>
+          <w:b/>
+          <w:bCs/>
+          <w:sz w:val="20"/>
+          <w:u w:val="single"/>
+        </w:rPr>
+        <w:drawing>
+          <wp:inline distT="0" distB="0" distL="0" distR="0" wp14:anchorId="264FF61F" wp14:editId="0179AF23">
+            <wp:extent cx="5949950" cy="2870835"/>
+            <wp:effectExtent l="0" t="0" r="0" b="5715"/>
+            <wp:docPr id="442407321" name="Picture 1"/>
+            <wp:cNvGraphicFramePr>
+              <a:graphicFrameLocks xmlns:a="http://schemas.openxmlformats.org/drawingml/2006/main" noChangeAspect="1"/>
+            </wp:cNvGraphicFramePr>
+            <a:graphic xmlns:a="http://schemas.openxmlformats.org/drawingml/2006/main">
+              <a:graphicData uri="http://schemas.openxmlformats.org/drawingml/2006/picture">
+                <pic:pic xmlns:pic="http://schemas.openxmlformats.org/drawingml/2006/picture">
+                  <pic:nvPicPr>
+                    <pic:cNvPr id="442407321" name=""/>
+                    <pic:cNvPicPr/>
+                  </pic:nvPicPr>
+                  <pic:blipFill>
+                    <a:blip r:embed="rId11"/>
+                    <a:stretch>
+                      <a:fillRect/>
+                    </a:stretch>
+                  </pic:blipFill>
+                  <pic:spPr>
+                    <a:xfrm>
+                      <a:off x="0" y="0"/>
+                      <a:ext cx="5949950" cy="2870835"/>
+                    </a:xfrm>
+                    <a:prstGeom prst="rect">
+                      <a:avLst/>
+                    </a:prstGeom>
+                  </pic:spPr>
+                </pic:pic>
+              </a:graphicData>
+            </a:graphic>
+          </wp:inline>
+        </w:drawing>
+      </w:r>
     </w:p>
     <w:p>
       <w:pPr>
@@ -788,13 +858,23 @@
         <w:t xml:space="preserve"> Link: </w:t>
       </w:r>
       <w:hyperlink r:id="rId12" w:history="1">
+        <w:proofErr w:type="spellStart"/>
         <w:r>
           <w:rPr>
             <w:rStyle w:val="Hyperlink"/>
             <w:rFonts w:ascii="Times New Roman"/>
             <w:sz w:val="20"/>
           </w:rPr>
-          <w:t>Jathinkumar-02/FSAD-Skill-12</w:t>
+          <w:t>lalithdev</w:t>
+        </w:r>
+        <w:proofErr w:type="spellEnd"/>
+        <w:r>
+          <w:rPr>
+            <w:rStyle w:val="Hyperlink"/>
+            <w:rFonts w:ascii="Times New Roman"/>
+            <w:sz w:val="20"/>
+          </w:rPr>
+          <w:t>/FSAD-Skill-Experiment-12</w:t>
         </w:r>
       </w:hyperlink>
     </w:p>
@@ -843,51 +923,6 @@
     </w:p>
   </w:footnote>
 </w:footnotes>
-</file>
-
-<file path=word/header1.xml><?xml version="1.0" encoding="utf-8"?>
-<w:hdr xmlns:wpc="http://schemas.microsoft.com/office/word/2010/wordprocessingCanvas" xmlns:cx="http://schemas.microsoft.com/office/drawing/2014/chartex" xmlns:cx1="http://schemas.microsoft.com/office/drawing/2015/9/8/chartex" xmlns:cx2="http://schemas.microsoft.com/office/drawing/2015/10/21/chartex" xmlns:cx3="http://schemas.microsoft.com/office/drawing/2016/5/9/chartex" xmlns:cx4="http://schemas.microsoft.com/office/drawing/2016/5/10/chartex" xmlns:cx5="http://schemas.microsoft.com/office/drawing/2016/5/11/chartex" xmlns:cx6="http://schemas.microsoft.com/office/drawing/2016/5/12/chartex" xmlns:cx7="http://schemas.microsoft.com/office/drawing/2016/5/13/chartex" xmlns:cx8="http://schemas.microsoft.com/office/drawing/2016/5/14/chartex" xmlns:mc="http://schemas.openxmlformats.org/markup-compatibility/2006" xmlns:aink="http://schemas.microsoft.com/office/drawing/2016/ink" xmlns:am3d="http://schemas.microsoft.com/office/drawing/2017/model3d" xmlns:o="urn:schemas-microsoft-com:office:office" xmlns:oel="http://schemas.microsoft.com/office/2019/extlst" xmlns:r="http://schemas.openxmlformats.org/officeDocument/2006/relationships" xmlns:m="http://schemas.openxmlformats.org/officeDocument/2006/math" xmlns:v="urn:schemas-microsoft-com:vml" xmlns:wp14="http://schemas.microsoft.com/office/word/2010/wordprocessingDrawing" xmlns:wp="http://schemas.openxmlformats.org/drawingml/2006/wordprocessingDrawing" xmlns:w10="urn:schemas-microsoft-com:office:word" xmlns:w="http://schemas.openxmlformats.org/wordprocessingml/2006/main" xmlns:w14="http://schemas.microsoft.com/office/word/2010/wordml" xmlns:w15="http://schemas.microsoft.com/office/word/2012/wordml" xmlns:w16cex="http://schemas.microsoft.com/office/word/2018/wordml/cex" xmlns:w16cid="http://schemas.microsoft.com/office/word/2016/wordml/cid" xmlns:w16="http://schemas.microsoft.com/office/word/2018/wordml" xmlns:w16du="http://schemas.microsoft.com/office/word/2023/wordml/word16du" xmlns:w16sdtdh="http://schemas.microsoft.com/office/word/2020/wordml/sdtdatahash" xmlns:w16sdtfl="http://schemas.microsoft.com/office/word/2024/wordml/sdtformatlock" xmlns:w16se="http://schemas.microsoft.com/office/word/2015/wordml/symex" xmlns:wpg="http://schemas.microsoft.com/office/word/2010/wordprocessingGroup" xmlns:wpi="http://schemas.microsoft.com/office/word/2010/wordprocessingInk" xmlns:wne="http://schemas.microsoft.com/office/word/2006/wordml" xmlns:wps="http://schemas.microsoft.com/office/word/2010/wordprocessingShape" mc:Ignorable="w14 w15 w16se w16cid w16 w16cex w16sdtdh w16sdtfl w16du wp14">
-  <w:p>
-    <w:pPr>
-      <w:pStyle w:val="Header"/>
-    </w:pPr>
-    <w:proofErr w:type="spellStart"/>
-    <w:r>
-      <w:t>Aravala</w:t>
-    </w:r>
-    <w:proofErr w:type="spellEnd"/>
-    <w:r>
-      <w:t xml:space="preserve"> Tirupathi Venkata Jathin Kumar</w:t>
-    </w:r>
-  </w:p>
-  <w:p>
-    <w:pPr>
-      <w:pStyle w:val="Header"/>
-    </w:pPr>
-    <w:r>
-      <w:t>2400031</w:t>
-    </w:r>
-    <w:r>
-      <w:t>734</w:t>
-    </w:r>
-  </w:p>
-  <w:p>
-    <w:pPr>
-      <w:pStyle w:val="Header"/>
-    </w:pPr>
-    <w:r>
-      <w:t>S-</w:t>
-    </w:r>
-    <w:r>
-      <w:t>22</w:t>
-    </w:r>
-  </w:p>
-  <w:p>
-    <w:pPr>
-      <w:pStyle w:val="Header"/>
-    </w:pPr>
-  </w:p>
-</w:hdr>
 </file>
 
 <file path=word/styles.xml><?xml version="1.0" encoding="utf-8"?>
@@ -1294,6 +1329,7 @@
   <w:style w:type="character" w:default="1" w:styleId="DefaultParagraphFont">
     <w:name w:val="Default Paragraph Font"/>
     <w:uiPriority w:val="1"/>
+    <w:semiHidden/>
     <w:unhideWhenUsed/>
   </w:style>
   <w:style w:type="table" w:default="1" w:styleId="TableNormal">

</xml_diff>